<commit_message>
docs: submission v3 — deep-sweep corrections and additions
</commit_message>
<xml_diff>
--- a/docs/Aegis-Submission.docx
+++ b/docs/Aegis-Submission.docx
@@ -2844,7 +2844,23 @@
           <w:i/>
           <w:color w:val="52525B"/>
         </w:rPr>
-        <w:t xml:space="preserve"> Links between events require concrete, checkable evidence — same district, ≤30 km geo-radius, ≤96 h time window, shared phone number, or an exact money-trail match (amount ±1% AND 0–96 h window AND district). The LLM </w:t>
+        <w:t xml:space="preserve"> Links between events require concrete, checkable evidence — same district, ≤30 km geo-radius, ≤96 h time window, shared phone number, or an exact money-trail match (amount ±1% AND payment 0–96 h after the call; district is reported as a </w:t>
+      </w:r>
+      <w:r>
+        <w:rPr>
+          <w:b w:val="0"/>
+          <w:i/>
+          <w:color w:val="52525B"/>
+        </w:rPr>
+        <w:t>bonus</w:t>
+      </w:r>
+      <w:r>
+        <w:rPr>
+          <w:b w:val="0"/>
+          <w:i/>
+          <w:color w:val="52525B"/>
+        </w:rPr>
+        <w:t xml:space="preserve"> signal when it lines up, never used as a gate — mule rings deliberately operate far from their victims, that is the point of layering). The LLM </w:t>
       </w:r>
       <w:r>
         <w:rPr>
@@ -3087,7 +3103,55 @@
           <w:b w:val="0"/>
           <w:i w:val="0"/>
         </w:rPr>
-        <w:t xml:space="preserve">, because each stage sets up the next. Playbooks are encoded as small finite ontologies (not learned, not generated — no labelled reasoning chains exist to train on, and a generated chain can hallucinate, which is fatal for legal admissibility). A match is deterministic: </w:t>
+        <w:t>, because each stage sets up the next. Three playbooks are encoded (</w:t>
+      </w:r>
+      <w:r>
+        <w:rPr>
+          <w:rFonts w:ascii="Consolas" w:hAnsi="Consolas"/>
+          <w:b w:val="0"/>
+          <w:i w:val="0"/>
+          <w:sz w:val="20"/>
+        </w:rPr>
+        <w:t>digital_arrest</w:t>
+      </w:r>
+      <w:r>
+        <w:rPr>
+          <w:b w:val="0"/>
+          <w:i w:val="0"/>
+        </w:rPr>
+        <w:t xml:space="preserve">, </w:t>
+      </w:r>
+      <w:r>
+        <w:rPr>
+          <w:rFonts w:ascii="Consolas" w:hAnsi="Consolas"/>
+          <w:b w:val="0"/>
+          <w:i w:val="0"/>
+          <w:sz w:val="20"/>
+        </w:rPr>
+        <w:t>kyc_fraud</w:t>
+      </w:r>
+      <w:r>
+        <w:rPr>
+          <w:b w:val="0"/>
+          <w:i w:val="0"/>
+        </w:rPr>
+        <w:t xml:space="preserve">, </w:t>
+      </w:r>
+      <w:r>
+        <w:rPr>
+          <w:rFonts w:ascii="Consolas" w:hAnsi="Consolas"/>
+          <w:b w:val="0"/>
+          <w:i w:val="0"/>
+          <w:sz w:val="20"/>
+        </w:rPr>
+        <w:t>advance_fee</w:t>
+      </w:r>
+      <w:r>
+        <w:rPr>
+          <w:b w:val="0"/>
+          <w:i w:val="0"/>
+        </w:rPr>
+        <w:t xml:space="preserve">) as small finite ontologies (not learned, not generated — no labelled reasoning chains exist to train on, and a generated chain can hallucinate, which is fatal for legal admissibility). A match is deterministic: </w:t>
       </w:r>
       <w:r>
         <w:rPr>
@@ -3548,14 +3612,14 @@
           <w:b/>
           <w:i w:val="0"/>
         </w:rPr>
-        <w:t>snaps seizures to transport corridors</w:t>
-      </w:r>
-      <w:r>
-        <w:rPr>
-          <w:b w:val="0"/>
-          <w:i w:val="0"/>
-        </w:rPr>
-        <w:t xml:space="preserve"> (rail / road / ship / air), clusters them along each corridor, walks outward from the densest cluster to infer the </w:t>
+        <w:t>snaps seizures to real, documented transport corridors</w:t>
+      </w:r>
+      <w:r>
+        <w:rPr>
+          <w:b w:val="0"/>
+          <w:i w:val="0"/>
+        </w:rPr>
+        <w:t xml:space="preserve"> (rail / road / ship / air — e.g. the Howrah–Delhi Grand Chord through the Jamtara–Dhanbad–Asansol belt, historically the highest counterfeit-transit corridor in East India per RBI intelligence), clusters them along each corridor, walks outward from the densest cluster to infer the </w:t>
       </w:r>
       <w:r>
         <w:rPr>
@@ -3881,7 +3945,7 @@
           <w:b w:val="0"/>
           <w:i w:val="0"/>
         </w:rPr>
-        <w:t xml:space="preserve"> is matched — amount (±1%) + payment window (0–96 h after the call) + district — against </w:t>
+        <w:t xml:space="preserve"> is matched — amount (±1%) + payment window (0–96 h after the call) — against </w:t>
       </w:r>
       <w:r>
         <w:rPr>
@@ -3895,7 +3959,7 @@
           <w:b w:val="0"/>
           <w:i w:val="0"/>
         </w:rPr>
-        <w:t xml:space="preserve">. Output: </w:t>
+        <w:t xml:space="preserve">, with district reported as bonus corroboration when it lines up (never required: mule rings deliberately sit far from their victims). Output: </w:t>
       </w:r>
       <w:r>
         <w:rPr>
@@ -3959,21 +4023,21 @@
           <w:b w:val="0"/>
           <w:i w:val="0"/>
         </w:rPr>
-        <w:t xml:space="preserve">DBSCAN clusters all event types together on haversine distance; a hotspot where </w:t>
+        <w:t xml:space="preserve">DBSCAN clusters all event types together on haversine distance (25 km neighbourhood), with </w:t>
       </w:r>
       <w:r>
         <w:rPr>
           <w:b/>
           <w:i w:val="0"/>
         </w:rPr>
-        <w:t>independent detection systems converge</w:t>
-      </w:r>
-      <w:r>
-        <w:rPr>
-          <w:b w:val="0"/>
-          <w:i w:val="0"/>
-        </w:rPr>
-        <w:t xml:space="preserve"> (scam + counterfeit + ring in one geo-cluster) is flagged as a </w:t>
+        <w:t>honest hub tiers</w:t>
+      </w:r>
+      <w:r>
+        <w:rPr>
+          <w:b w:val="0"/>
+          <w:i w:val="0"/>
+        </w:rPr>
+        <w:t xml:space="preserve">: all three crime domains converging in one cluster = </w:t>
       </w:r>
       <w:r>
         <w:rPr>
@@ -3987,7 +4051,21 @@
           <w:b w:val="0"/>
           <w:i w:val="0"/>
         </w:rPr>
-        <w:t xml:space="preserve"> — the red pulsing circle on the command-centre map. Single-domain hotspot maps exist; cross-domain convergence detection does not.</w:t>
+        <w:t xml:space="preserve"> (the red pulsing circle — the strongest, most specific signal possible); exactly two domains = a </w:t>
+      </w:r>
+      <w:r>
+        <w:rPr>
+          <w:b w:val="0"/>
+          <w:i/>
+        </w:rPr>
+        <w:t>multi-signal</w:t>
+      </w:r>
+      <w:r>
+        <w:rPr>
+          <w:b w:val="0"/>
+          <w:i w:val="0"/>
+        </w:rPr>
+        <w:t xml:space="preserve"> cluster, reported but never overclaimed as "coordinated" — accuracy over drama, encoded in the tier logic itself. Single-domain hotspot maps exist; cross-domain convergence detection with tiered honesty does not.</w:t>
       </w:r>
     </w:p>
     <w:p>
@@ -7008,7 +7086,9 @@
         <w:br/>
         <w:t xml:space="preserve">                                          time ≤96 h / shared_phone</w:t>
         <w:br/>
-        <w:t xml:space="preserve">                                        · money trail: amount ±1% ∧ 0–96 h ∧ district → ring account</w:t>
+        <w:t xml:space="preserve">                                        · money trail: amount ±1% ∧ 0–96 h → ring account</w:t>
+        <w:br/>
+        <w:t xml:space="preserve">                                          (district = bonus corroboration, never a gate)</w:t>
         <w:br/>
         <w:t xml:space="preserve">                                        · threat level = # distinct domains linked (3 = CRITICAL)</w:t>
         <w:br/>
@@ -9142,7 +9222,7 @@
           <w:b w:val="0"/>
           <w:i w:val="0"/>
         </w:rPr>
-        <w:t xml:space="preserve">, </w:t>
+        <w:t xml:space="preserve"> (critical 30 min · high 2 h · medium 24 h — a UPI transfer clears in seconds, so a freeze must beat cash-out), </w:t>
       </w:r>
       <w:r>
         <w:rPr>
@@ -9172,7 +9252,58 @@
           <w:b w:val="0"/>
           <w:i w:val="0"/>
         </w:rPr>
-        <w:t>; the engine never asserts guilt.</w:t>
+        <w:t>; the engine never asserts guilt, and every action carries that disclaimer in its payload.</w:t>
+      </w:r>
+    </w:p>
+    <w:p>
+      <w:pPr>
+        <w:pStyle w:val="ListBullet"/>
+      </w:pPr>
+      <w:r>
+        <w:rPr>
+          <w:b/>
+          <w:i w:val="0"/>
+        </w:rPr>
+        <w:t>Bank Partner console</w:t>
+      </w:r>
+      <w:r>
+        <w:rPr>
+          <w:b w:val="0"/>
+          <w:i w:val="0"/>
+        </w:rPr>
+        <w:t xml:space="preserve">: the B2B surface made visible — a live console for </w:t>
+      </w:r>
+      <w:r>
+        <w:rPr>
+          <w:rFonts w:ascii="Consolas" w:hAnsi="Consolas"/>
+          <w:b w:val="0"/>
+          <w:i w:val="0"/>
+          <w:sz w:val="20"/>
+        </w:rPr>
+        <w:t>screen-account</w:t>
+      </w:r>
+      <w:r>
+        <w:rPr>
+          <w:b w:val="0"/>
+          <w:i w:val="0"/>
+        </w:rPr>
+        <w:t xml:space="preserve"> (risk bands ≥0.7 high → BLOCK + file STR, ≥0.4 medium → EDD, else monitor/clear) and terse pass/fail </w:t>
+      </w:r>
+      <w:r>
+        <w:rPr>
+          <w:rFonts w:ascii="Consolas" w:hAnsi="Consolas"/>
+          <w:b w:val="0"/>
+          <w:i w:val="0"/>
+          <w:sz w:val="20"/>
+        </w:rPr>
+        <w:t>verify-note</w:t>
+      </w:r>
+      <w:r>
+        <w:rPr>
+          <w:b w:val="0"/>
+          <w:i w:val="0"/>
+        </w:rPr>
+        <w:t xml:space="preserve"> responses shaped for a POS terminal, with the surface's documentation on the same panel.</w:t>
       </w:r>
     </w:p>
     <w:p>
@@ -10353,7 +10484,7 @@
           <w:b w:val="0"/>
           <w:i w:val="0"/>
         </w:rPr>
-        <w:t xml:space="preserve"> files only; Twilio webhook HMAC signature validation; SSRF-hardened verification tools; API-key gating on B2B endpoints; ingest schema validation at the backend door; environment-scoped CORS; no citizen PII stored beyond the event payloads a deployment would own.</w:t>
+        <w:t xml:space="preserve"> files only; Twilio webhook HMAC signature validation; SSRF-hardened verification tools; API-key gating on B2B endpoints (with X-API-Key pass-through at the gateway); ingest schema validation at the backend door; origin-allowlisted CORS and request-size caps at the gateway, environment-scoped CORS everywhere else; no citizen PII stored beyond the bounded event store (500 events per domain) a deployment would own.</w:t>
       </w:r>
     </w:p>
     <w:p>

</xml_diff>